<commit_message>
Update contract v1.1: correct pricing, PAYG, service from day 1
</commit_message>
<xml_diff>
--- a/kontrakt/Oppdragsavtale-KIF-STOLL.docx
+++ b/kontrakt/Oppdragsavtale-KIF-STOLL.docx
@@ -57,14 +57,13 @@
     </w:p>
     <w:p>
       <w:pPr>
-        <w:spacing w:after="120"/>
         <w:jc w:val="center"/>
       </w:pPr>
       <w:r>
         <w:rPr>
           <w:sz w:val="22"/>
         </w:rPr>
-        <w:t>Versjon 1.0 — Mars 2026</w:t>
+        <w:t>Versjon 1.1 — Mars 2026</w:t>
       </w:r>
     </w:p>
     <w:p>
@@ -330,29 +329,13 @@
     <w:p>
       <w:pPr/>
       <w:r>
-        <w:t>5.2  Betaling skjer etter følgende plan:</w:t>
-      </w:r>
-    </w:p>
-    <w:p>
-      <w:pPr>
-        <w:pStyle w:val="ListBullet"/>
-      </w:pPr>
-      <w:r>
-        <w:t>50 % ved signering av avtalen (kr 9 500,-)</w:t>
-      </w:r>
-    </w:p>
-    <w:p>
-      <w:pPr>
-        <w:pStyle w:val="ListBullet"/>
-      </w:pPr>
-      <w:r>
-        <w:t>50 % ved endelig leveranse og godkjenning (kr 9 500,-)</w:t>
+        <w:t>5.2  Betaling for nettside-utvikling skjer som én engangsfaktura ved signering av avtalen.</w:t>
       </w:r>
     </w:p>
     <w:p>
       <w:pPr/>
       <w:r>
-        <w:t>5.3  Løpende serviceavtale faktureres årlig forskudd med oppstart fra leveransedato.</w:t>
+        <w:t>5.3  Løpende serviceavtale og AI-tjenester faktureres månedlig fra oppstart av oppdraget.</w:t>
       </w:r>
     </w:p>
     <w:p>
@@ -371,6 +354,12 @@
       <w:pPr/>
       <w:r>
         <w:t>5.6  Leverandøren kan stanse videre arbeid og holde tilbake leveranser ved mislighold av betalingsforpliktelser.</w:t>
+      </w:r>
+    </w:p>
+    <w:p>
+      <w:pPr/>
+      <w:r>
+        <w:t>5.7  Forbruk utover inkluderte kvoter (se Vedlegg B) faktureres som «Pay As You Go» etter gjeldende satser.</w:t>
       </w:r>
     </w:p>
     <w:p>
@@ -859,18 +848,6 @@
         <w:rPr>
           <w:b/>
         </w:rPr>
-        <w:t>Beskrivelse av leveranse:</w:t>
-      </w:r>
-    </w:p>
-    <w:p>
-      <w:pPr/>
-    </w:p>
-    <w:p>
-      <w:pPr/>
-      <w:r>
-        <w:rPr>
-          <w:b/>
-        </w:rPr>
         <w:t>A.1 Leveranse: Ny nettside med CMS</w:t>
       </w:r>
     </w:p>
@@ -1105,7 +1082,7 @@
         <w:pStyle w:val="ListBullet"/>
       </w:pPr>
       <w:r>
-        <w:t>Kvote: 500 chatmeldinger per måned</w:t>
+        <w:t>Kvote: 500 chatmeldinger per måned inkludert</w:t>
       </w:r>
     </w:p>
     <w:p>
@@ -1141,7 +1118,7 @@
         <w:pStyle w:val="ListBullet"/>
       </w:pPr>
       <w:r>
-        <w:t>Kvote: 15 artikler og 20 bilder per måned</w:t>
+        <w:t>Kvote: 15 artikler/SoMe-innlegg og 20 bilder per måned inkludert</w:t>
       </w:r>
     </w:p>
     <w:p>
@@ -1456,7 +1433,7 @@
               <w:rPr>
                 <w:b/>
               </w:rPr>
-              <w:t>Rabatt</w:t>
+              <w:t>Spesialpris STOLL</w:t>
             </w:r>
           </w:p>
         </w:tc>
@@ -1501,7 +1478,7 @@
           </w:tcPr>
           <w:p>
             <w:r>
-              <w:t>50% lag/forening</w:t>
+              <w:t>Lag/forening-rabatt</w:t>
             </w:r>
           </w:p>
         </w:tc>
@@ -1533,7 +1510,7 @@
           </w:tcPr>
           <w:p>
             <w:r>
-              <w:t>kr 20 000,-</w:t>
+              <w:t>kr 10 000,-</w:t>
             </w:r>
           </w:p>
         </w:tc>
@@ -1543,7 +1520,7 @@
           </w:tcPr>
           <w:p>
             <w:r>
-              <w:t>50% lag/forening</w:t>
+              <w:t>Inkludert</w:t>
             </w:r>
           </w:p>
         </w:tc>
@@ -1553,7 +1530,7 @@
           </w:tcPr>
           <w:p>
             <w:r>
-              <w:t>kr 10 000,-</w:t>
+              <w:t>kr 0,-</w:t>
             </w:r>
           </w:p>
         </w:tc>
@@ -1591,7 +1568,7 @@
           </w:tcPr>
           <w:p>
             <w:r>
-              <w:t>kr 19 000,-</w:t>
+              <w:t>kr 9 000,-</w:t>
             </w:r>
           </w:p>
         </w:tc>
@@ -1606,7 +1583,25 @@
         <w:rPr>
           <w:b/>
         </w:rPr>
-        <w:t>Løpende kostnader (månedlig)</w:t>
+        <w:t>Betalingsplan engangskostnad:</w:t>
+      </w:r>
+    </w:p>
+    <w:p>
+      <w:pPr/>
+      <w:r>
+        <w:t>Engangskostnaden på kr 9 000,- eks. MVA faktureres i sin helhet ved signering av avtalen.</w:t>
+      </w:r>
+    </w:p>
+    <w:p>
+      <w:pPr/>
+    </w:p>
+    <w:p>
+      <w:pPr/>
+      <w:r>
+        <w:rPr>
+          <w:b/>
+        </w:rPr>
+        <w:t>Løpende kostnader (månedlig, fra oppstart)</w:t>
       </w:r>
     </w:p>
     <w:p>
@@ -1659,7 +1654,7 @@
               <w:rPr>
                 <w:b/>
               </w:rPr>
-              <w:t>Pris eks. MVA</w:t>
+              <w:t>Spesialpris STOLL</w:t>
             </w:r>
           </w:p>
         </w:tc>
@@ -1768,7 +1763,7 @@
         <w:rPr>
           <w:sz w:val="20"/>
         </w:rPr>
-        <w:t>Serviceavtale faktureres årlig forskudd: kr 7 176,- eks. MVA</w:t>
+        <w:t>Serviceavtalen og AI-tjenester faktureres månedlig fra oppstart av oppdraget.</w:t>
       </w:r>
     </w:p>
     <w:p>
@@ -1780,7 +1775,271 @@
         <w:rPr>
           <w:b/>
         </w:rPr>
-        <w:t>Tilleggsarbeid</w:t>
+        <w:t>Inkluderte kvoter per måned</w:t>
+      </w:r>
+    </w:p>
+    <w:p>
+      <w:pPr/>
+      <w:r>
+        <w:t>De inkluderte kvotene er dimensjonert for å dekke normal bruk basert på nettsidens nåværende trafikk og aktivitetsnivå. For de aller fleste måneder vil inkludert forbruk være mer enn tilstrekkelig.</w:t>
+      </w:r>
+    </w:p>
+    <w:p>
+      <w:pPr/>
+    </w:p>
+    <w:tbl>
+      <w:tblPr>
+        <w:tblW w:type="auto" w:w="0"/>
+        <w:jc w:val="center"/>
+        <w:tblLook w:firstColumn="1" w:firstRow="1" w:lastColumn="0" w:lastRow="0" w:noHBand="0" w:noVBand="1" w:val="04A0"/>
+      </w:tblPr>
+      <w:tblGrid>
+        <w:gridCol w:w="4561"/>
+        <w:gridCol w:w="4561"/>
+      </w:tblGrid>
+      <w:tr>
+        <w:tc>
+          <w:tcPr>
+            <w:tcW w:type="dxa" w:w="4561"/>
+          </w:tcPr>
+          <w:p>
+            <w:r>
+              <w:rPr>
+                <w:b/>
+              </w:rPr>
+              <w:t>Tjeneste</w:t>
+            </w:r>
+          </w:p>
+        </w:tc>
+        <w:tc>
+          <w:tcPr>
+            <w:tcW w:type="dxa" w:w="4561"/>
+          </w:tcPr>
+          <w:p>
+            <w:r>
+              <w:rPr>
+                <w:b/>
+              </w:rPr>
+              <w:t>Inkludert per måned</w:t>
+            </w:r>
+          </w:p>
+        </w:tc>
+      </w:tr>
+      <w:tr>
+        <w:tc>
+          <w:tcPr>
+            <w:tcW w:type="dxa" w:w="4561"/>
+          </w:tcPr>
+          <w:p>
+            <w:r>
+              <w:t>Chatbot-meldinger</w:t>
+            </w:r>
+          </w:p>
+        </w:tc>
+        <w:tc>
+          <w:tcPr>
+            <w:tcW w:type="dxa" w:w="4561"/>
+          </w:tcPr>
+          <w:p>
+            <w:r>
+              <w:t>500 stk</w:t>
+            </w:r>
+          </w:p>
+        </w:tc>
+      </w:tr>
+      <w:tr>
+        <w:tc>
+          <w:tcPr>
+            <w:tcW w:type="dxa" w:w="4561"/>
+          </w:tcPr>
+          <w:p>
+            <w:r>
+              <w:t>Artikler / SoMe-innlegg</w:t>
+            </w:r>
+          </w:p>
+        </w:tc>
+        <w:tc>
+          <w:tcPr>
+            <w:tcW w:type="dxa" w:w="4561"/>
+          </w:tcPr>
+          <w:p>
+            <w:r>
+              <w:t>15 stk</w:t>
+            </w:r>
+          </w:p>
+        </w:tc>
+      </w:tr>
+      <w:tr>
+        <w:tc>
+          <w:tcPr>
+            <w:tcW w:type="dxa" w:w="4561"/>
+          </w:tcPr>
+          <w:p>
+            <w:r>
+              <w:t>AI-genererte bilder</w:t>
+            </w:r>
+          </w:p>
+        </w:tc>
+        <w:tc>
+          <w:tcPr>
+            <w:tcW w:type="dxa" w:w="4561"/>
+          </w:tcPr>
+          <w:p>
+            <w:r>
+              <w:t>20 stk</w:t>
+            </w:r>
+          </w:p>
+        </w:tc>
+      </w:tr>
+    </w:tbl>
+    <w:p>
+      <w:pPr/>
+    </w:p>
+    <w:p>
+      <w:pPr/>
+      <w:r>
+        <w:rPr>
+          <w:b/>
+        </w:rPr>
+        <w:t>Pay As You Go — forbruk utover inkluderte kvoter</w:t>
+      </w:r>
+    </w:p>
+    <w:p>
+      <w:pPr/>
+      <w:r>
+        <w:t>Dersom kunden ønsker eller har behov for å benytte tjenester utover de inkluderte kvotene, tilbys dette som «Pay As You Go». Dette sikrer at tjenestene alltid er tilgjengelige uten avbrudd, uavhengig av forbruk.</w:t>
+      </w:r>
+    </w:p>
+    <w:p>
+      <w:pPr/>
+    </w:p>
+    <w:tbl>
+      <w:tblPr>
+        <w:tblW w:type="auto" w:w="0"/>
+        <w:jc w:val="center"/>
+        <w:tblLook w:firstColumn="1" w:firstRow="1" w:lastColumn="0" w:lastRow="0" w:noHBand="0" w:noVBand="1" w:val="04A0"/>
+      </w:tblPr>
+      <w:tblGrid>
+        <w:gridCol w:w="4561"/>
+        <w:gridCol w:w="4561"/>
+      </w:tblGrid>
+      <w:tr>
+        <w:tc>
+          <w:tcPr>
+            <w:tcW w:type="dxa" w:w="4561"/>
+          </w:tcPr>
+          <w:p>
+            <w:r>
+              <w:rPr>
+                <w:b/>
+              </w:rPr>
+              <w:t>Tjeneste</w:t>
+            </w:r>
+          </w:p>
+        </w:tc>
+        <w:tc>
+          <w:tcPr>
+            <w:tcW w:type="dxa" w:w="4561"/>
+          </w:tcPr>
+          <w:p>
+            <w:r>
+              <w:rPr>
+                <w:b/>
+              </w:rPr>
+              <w:t>Pris per enhet eks. MVA</w:t>
+            </w:r>
+          </w:p>
+        </w:tc>
+      </w:tr>
+      <w:tr>
+        <w:tc>
+          <w:tcPr>
+            <w:tcW w:type="dxa" w:w="4561"/>
+          </w:tcPr>
+          <w:p>
+            <w:r>
+              <w:t>Chatbot-melding (utover 500/mnd)</w:t>
+            </w:r>
+          </w:p>
+        </w:tc>
+        <w:tc>
+          <w:tcPr>
+            <w:tcW w:type="dxa" w:w="4561"/>
+          </w:tcPr>
+          <w:p>
+            <w:r>
+              <w:t>kr 0,50 per melding</w:t>
+            </w:r>
+          </w:p>
+        </w:tc>
+      </w:tr>
+      <w:tr>
+        <w:tc>
+          <w:tcPr>
+            <w:tcW w:type="dxa" w:w="4561"/>
+          </w:tcPr>
+          <w:p>
+            <w:r>
+              <w:t>SoMe-innlegg med bilde (utover 15/mnd)</w:t>
+            </w:r>
+          </w:p>
+        </w:tc>
+        <w:tc>
+          <w:tcPr>
+            <w:tcW w:type="dxa" w:w="4561"/>
+          </w:tcPr>
+          <w:p>
+            <w:r>
+              <w:t>kr 49,- per innlegg</w:t>
+            </w:r>
+          </w:p>
+        </w:tc>
+      </w:tr>
+      <w:tr>
+        <w:tc>
+          <w:tcPr>
+            <w:tcW w:type="dxa" w:w="4561"/>
+          </w:tcPr>
+          <w:p>
+            <w:r>
+              <w:t>AI-generert bilde (utover 20/mnd)</w:t>
+            </w:r>
+          </w:p>
+        </w:tc>
+        <w:tc>
+          <w:tcPr>
+            <w:tcW w:type="dxa" w:w="4561"/>
+          </w:tcPr>
+          <w:p>
+            <w:r>
+              <w:t>kr 19,- per bilde</w:t>
+            </w:r>
+          </w:p>
+        </w:tc>
+      </w:tr>
+    </w:tbl>
+    <w:p>
+      <w:pPr/>
+    </w:p>
+    <w:p>
+      <w:pPr/>
+      <w:r>
+        <w:rPr>
+          <w:sz w:val="20"/>
+        </w:rPr>
+        <w:t>Overskridelse av kvoter faktureres etterskuddsvis sammen med neste månedsfaktura. Kunden varsles når 80 % av en kvote er brukt opp.</w:t>
+      </w:r>
+    </w:p>
+    <w:p>
+      <w:pPr/>
+    </w:p>
+    <w:p>
+      <w:pPr/>
+      <w:r>
+        <w:rPr>
+          <w:b/>
+        </w:rPr>
+        <w:t>Tilleggsarbeid (utviklingstimer)</w:t>
       </w:r>
     </w:p>
     <w:p>
@@ -1870,126 +2129,6 @@
       </w:tr>
     </w:tbl>
     <w:p>
-      <w:pPr/>
-    </w:p>
-    <w:p>
-      <w:pPr/>
-      <w:r>
-        <w:rPr>
-          <w:b/>
-        </w:rPr>
-        <w:t>Betalingsplan engangskostnad</w:t>
-      </w:r>
-    </w:p>
-    <w:p>
-      <w:pPr/>
-    </w:p>
-    <w:tbl>
-      <w:tblPr>
-        <w:tblW w:type="auto" w:w="0"/>
-        <w:jc w:val="center"/>
-        <w:tblLook w:firstColumn="1" w:firstRow="1" w:lastColumn="0" w:lastRow="0" w:noHBand="0" w:noVBand="1" w:val="04A0"/>
-      </w:tblPr>
-      <w:tblGrid>
-        <w:gridCol w:w="4561"/>
-        <w:gridCol w:w="4561"/>
-      </w:tblGrid>
-      <w:tr>
-        <w:tc>
-          <w:tcPr>
-            <w:tcW w:type="dxa" w:w="4561"/>
-          </w:tcPr>
-          <w:p>
-            <w:r>
-              <w:rPr>
-                <w:b/>
-              </w:rPr>
-              <w:t>Tidspunkt</w:t>
-            </w:r>
-          </w:p>
-        </w:tc>
-        <w:tc>
-          <w:tcPr>
-            <w:tcW w:type="dxa" w:w="4561"/>
-          </w:tcPr>
-          <w:p>
-            <w:r>
-              <w:rPr>
-                <w:b/>
-              </w:rPr>
-              <w:t>Beløp eks. MVA</w:t>
-            </w:r>
-          </w:p>
-        </w:tc>
-      </w:tr>
-      <w:tr>
-        <w:tc>
-          <w:tcPr>
-            <w:tcW w:type="dxa" w:w="4561"/>
-          </w:tcPr>
-          <w:p>
-            <w:r>
-              <w:t>Ved signering</w:t>
-            </w:r>
-          </w:p>
-        </w:tc>
-        <w:tc>
-          <w:tcPr>
-            <w:tcW w:type="dxa" w:w="4561"/>
-          </w:tcPr>
-          <w:p>
-            <w:r>
-              <w:t>kr 9 500,-</w:t>
-            </w:r>
-          </w:p>
-        </w:tc>
-      </w:tr>
-      <w:tr>
-        <w:tc>
-          <w:tcPr>
-            <w:tcW w:type="dxa" w:w="4561"/>
-          </w:tcPr>
-          <w:p>
-            <w:r>
-              <w:t>Ved endelig leveranse</w:t>
-            </w:r>
-          </w:p>
-        </w:tc>
-        <w:tc>
-          <w:tcPr>
-            <w:tcW w:type="dxa" w:w="4561"/>
-          </w:tcPr>
-          <w:p>
-            <w:r>
-              <w:t>kr 9 500,-</w:t>
-            </w:r>
-          </w:p>
-        </w:tc>
-      </w:tr>
-      <w:tr>
-        <w:tc>
-          <w:tcPr>
-            <w:tcW w:type="dxa" w:w="4561"/>
-          </w:tcPr>
-          <w:p>
-            <w:r>
-              <w:t>Totalt</w:t>
-            </w:r>
-          </w:p>
-        </w:tc>
-        <w:tc>
-          <w:tcPr>
-            <w:tcW w:type="dxa" w:w="4561"/>
-          </w:tcPr>
-          <w:p>
-            <w:r>
-              <w:t>kr 19 000,-</w:t>
-            </w:r>
-          </w:p>
-        </w:tc>
-      </w:tr>
-    </w:tbl>
-    <w:p>
       <w:r>
         <w:br w:type="page"/>
       </w:r>
@@ -2122,7 +2261,7 @@
     <w:p>
       <w:pPr/>
       <w:r>
-        <w:t>Serviceavtalen koster kr 399,– eks. MVA per måned (kr 4 788,- per år). AI-tjenester koster kr 199,- eks. MVA per måned. Total månedskostnad: kr 598,- eks. MVA. Beløpet faktureres årlig forskudd.</w:t>
+        <w:t>Serviceavtalen koster kr 399,– eks. MVA per måned. AI-tjenester koster kr 199,- eks. MVA per måned (spesialpris for STOLL). Total månedskostnad: kr 598,- eks. MVA. Faktureres månedlig fra oppstart av oppdraget.</w:t>
       </w:r>
     </w:p>
     <w:p>
@@ -2136,7 +2275,7 @@
     <w:p>
       <w:pPr/>
       <w:r>
-        <w:t>Avtalen løper fra leveringsdato og fornyes automatisk månedlig. Avtalen kan sies opp av begge parter med 3 måneders skriftlig varsel.</w:t>
+        <w:t>Avtalen løper fra oppstart av oppdraget og fornyes automatisk månedlig. Avtalen kan sies opp av begge parter med 3 måneders skriftlig varsel.</w:t>
       </w:r>
     </w:p>
     <w:p>

</xml_diff>

<commit_message>
Fix: service+AI faktureres årlig forskudd, ikke månedlig
</commit_message>
<xml_diff>
--- a/kontrakt/Oppdragsavtale-KIF-STOLL.docx
+++ b/kontrakt/Oppdragsavtale-KIF-STOLL.docx
@@ -335,7 +335,7 @@
     <w:p>
       <w:pPr/>
       <w:r>
-        <w:t>5.3  Løpende serviceavtale og AI-tjenester faktureres månedlig fra oppstart av oppdraget.</w:t>
+        <w:t>5.3  Løpende serviceavtale og AI-tjenester faktureres årlig forskudd fra oppstart av oppdraget.</w:t>
       </w:r>
     </w:p>
     <w:p>
@@ -1601,7 +1601,7 @@
         <w:rPr>
           <w:b/>
         </w:rPr>
-        <w:t>Løpende kostnader (månedlig, fra oppstart)</w:t>
+        <w:t>Løpende kostnader (faktureres årlig forskudd)</w:t>
       </w:r>
     </w:p>
     <w:p>
@@ -1763,7 +1763,7 @@
         <w:rPr>
           <w:sz w:val="20"/>
         </w:rPr>
-        <w:t>Serviceavtalen og AI-tjenester faktureres månedlig fra oppstart av oppdraget.</w:t>
+        <w:t>Serviceavtalen og AI-tjenester faktureres årlig forskudd fra oppstart av oppdraget.</w:t>
       </w:r>
     </w:p>
     <w:p>
@@ -2027,7 +2027,7 @@
         <w:rPr>
           <w:sz w:val="20"/>
         </w:rPr>
-        <w:t>Overskridelse av kvoter faktureres etterskuddsvis sammen med neste månedsfaktura. Kunden varsles når 80 % av en kvote er brukt opp.</w:t>
+        <w:t>Overskridelse av kvoter faktureres kvartalsvis etterskuddsvis. Kunden varsles når 80 % av en kvote er brukt opp.</w:t>
       </w:r>
     </w:p>
     <w:p>
@@ -2261,7 +2261,7 @@
     <w:p>
       <w:pPr/>
       <w:r>
-        <w:t>Serviceavtalen koster kr 399,– eks. MVA per måned. AI-tjenester koster kr 199,- eks. MVA per måned (spesialpris for STOLL). Total månedskostnad: kr 598,- eks. MVA. Faktureres månedlig fra oppstart av oppdraget.</w:t>
+        <w:t>Serviceavtalen koster kr 399,– eks. MVA per måned. AI-tjenester koster kr 199,- eks. MVA per måned (spesialpris for STOLL). Total månedskostnad: kr 598,- eks. MVA. Faktureres årlig forskudd fra oppstart av oppdraget (kr 7 176,- eks. MVA per år).</w:t>
       </w:r>
     </w:p>
     <w:p>

</xml_diff>